<commit_message>
5.7.59 round: Apple released 5.7.55 on 10 Sep (unrecorded for 3 days); 5.7.59 live on Play, with Apple for review
Reviewer page, six tester pages, what-is, internal-status and both tester test plans re-stated:
iOS 5.7.55 LIVE (15:17Z 10 Sep) / 5.7.59 build 76 WAITING_FOR_REVIEW; Android 5.7.59 + TV LIVE
(vc 62 + 900000001); Huawei 5.7.34, four rounds behind. TestFlight: 75 installable, 76 attached.
5.7.59 content for testers and reviewers: the automatic 15-minute check-in is gone.

Co-Authored-By: Claude Fable 5.1 <noreply@anthropic.com>
Claude-Session: https://claude.ai/code/session_01BXu5Txa1V2GfhHwoxdWbcc
</commit_message>
<xml_diff>
--- a/downloads/knokkeroo-tester-test-plan-apple.docx
+++ b/downloads/knokkeroo-tester-test-plan-apple.docx
@@ -66,7 +66,7 @@
           </w:tcPr>
           <w:p>
             <w:r>
-              <w:t>iPhone + Apple Watch: App Store 5.7.46 — Apple approved and released it at 02:58 UTC on 9 September 2026, replacing 5.7.45, and it is what the App Store serves now. Read from the public iTunes lookup for app id 6776208791 (US and ZA storefronts, version 5.7.46, currentVersionReleaseDate 2026-09-09T02:58:22Z) and confirmed in App Store Connect (appStoreVersion 5.7.46, READY_FOR_SALE). Version 5.7.55 (build 75) has been SUBMITTED to Apple and is NOT public: its App Store Connect state is WAITING_FOR_REVIEW, releaseType AFTER_APPROVAL. TestFlight installs the same version as the App Store today. The newest build ATTACHED to the external group “knokkeroo Beta Testers iOS” is now build 75 = version 5.7.55, processingState VALID, not expired — but its externalBuildState is WAITING_FOR_BETA_REVIEW, so testers cannot install it yet. The newest build testers can actually install is still build 74 = version 5.7.46 (externalBuildState IN_BETA_TESTING). Attached is not installable. Google Play is already live on 5.7.55, so Android is ahead of iPhone at the moment. Apple TV: TestFlight build 68 (5.3.6), externalBuildState IN_BETA_TESTING, 4 testers — the TV app is not on the App Store (its only App Store Connect version record is 1.0 in state PREPARE_FOR_SUBMISSION, and the public iTunes lookup for id 6795920763 returns no result) and was not part of the 5.7.46 round. All build, version and tester-group facts read live from the App Store Connect API on 9 September 2026.</w:t>
+              <w:t>iPhone + Apple Watch: App Store 5.7.55 — Apple approved and released it at 15:17 UTC on 10 September 2026, replacing 5.7.46, and it is what the App Store serves now. Read from the public iTunes lookup for app id 6776208791 (US, ZA, NG and GB storefronts, version 5.7.55, currentVersionReleaseDate 2026-09-10T15:17:46Z) and confirmed in App Store Connect (appStoreVersion 5.7.55, READY_FOR_SALE). Version 5.7.59 (build 76) has been SUBMITTED to Apple and is NOT public: its App Store Connect state is WAITING_FOR_REVIEW, releaseType AFTER_APPROVAL. TestFlight installs the same version as the App Store today: build 75 = version 5.7.55 is IN_BETA_TESTING in the external group “knokkeroo Beta Testers iOS”. The newest build ATTACHED to that group is build 76 = version 5.7.59, processingState VALID, not expired — but its externalBuildState is WAITING_FOR_BETA_REVIEW, so testers cannot install it yet. Attached is not installable. Google Play is already live on 5.7.59, so Android is ahead of iPhone at the moment. What 5.7.59 changes for a tester: the app no longer records a check-in on its own while the phone sits idle — a check-in happens only when you do something (knok, open the app, widget, Watch, TV). On 5.7.59 a phone left untouched must NOT advance its own last-knok time. Apple TV: TestFlight build 68 (5.3.6), externalBuildState IN_BETA_TESTING, 4 testers — the TV app is not on the App Store (its only App Store Connect version record is 1.0 in state PREPARE_FOR_SUBMISSION, and the public iTunes lookup for id 6795920763 returns no result) and was not part of the 5.7.55 or 5.7.59 rounds. All build, version and tester-group facts read live from the App Store Connect API on 13 September 2026.</w:t>
             </w:r>
           </w:p>
         </w:tc>
@@ -141,7 +141,7 @@
           </w:tcPr>
           <w:p>
             <w:r>
-              <w:t>9 September 2026</w:t>
+              <w:t>13 September 2026</w:t>
             </w:r>
           </w:p>
         </w:tc>
@@ -433,7 +433,7 @@
               <w:rPr>
                 <w:sz w:val="18"/>
               </w:rPr>
-              <w:t>knokkeroo (5.7.46 — from the App Store, or TestFlight build 74, which is the same version) installs and launches.</w:t>
+              <w:t>knokkeroo (5.7.55 — from the App Store, or TestFlight build 75, which is the same version) installs and launches.</w:t>
             </w:r>
           </w:p>
         </w:tc>
@@ -1990,7 +1990,7 @@
               </w:rPr>
               <w:t>Lock Screen widget checks you in without unlocking the phone.</w:t>
               <w:br/>
-              <w:t>Preconditions: iPhone on 5.7.46, signed in. The public App Store app is enough — the Lock Screen widget shipped publicly in 5.7.28 and is in every release since, so this is no longer a testing-builds-only case.</w:t>
+              <w:t>Preconditions: iPhone on 5.7.55, signed in. The public App Store app is enough — the Lock Screen widget shipped publicly in 5.7.28 and is in every release since, so this is no longer a testing-builds-only case.</w:t>
             </w:r>
           </w:p>
         </w:tc>

</xml_diff>

<commit_message>
Apple released 5.7.59 (2026-09-13T23:59:39Z): iOS and Android level, nothing in review
Re-stamps every store-state sentence that said "the App Store serves 5.7.55; 5.7.59 is with
Apple for review": reviewer page (Document information block, subtitle, What-is-new), the
five tester pages, what-is, internal-status, and both tester test-plan .docx. TestFlight
build 76 = 5.7.59 is IN_BETA_TESTING (beta review approved). Caught by
scripts/store-release-drift.mjs on 15 Sep, ~36 h after the release (x62).

Co-Authored-By: Claude Fable 5.1 <noreply@anthropic.com>
Claude-Session: https://claude.ai/code/session_01BXu5Txa1V2GfhHwoxdWbcc
</commit_message>
<xml_diff>
--- a/downloads/knokkeroo-tester-test-plan-apple.docx
+++ b/downloads/knokkeroo-tester-test-plan-apple.docx
@@ -66,7 +66,7 @@
           </w:tcPr>
           <w:p>
             <w:r>
-              <w:t>iPhone + Apple Watch: App Store 5.7.55 — Apple approved and released it at 15:17 UTC on 10 September 2026, replacing 5.7.46, and it is what the App Store serves now. Read from the public iTunes lookup for app id 6776208791 (US, ZA, NG and GB storefronts, version 5.7.55, currentVersionReleaseDate 2026-09-10T15:17:46Z) and confirmed in App Store Connect (appStoreVersion 5.7.55, READY_FOR_SALE). Version 5.7.59 (build 76) has been SUBMITTED to Apple and is NOT public: its App Store Connect state is WAITING_FOR_REVIEW, releaseType AFTER_APPROVAL. TestFlight installs the same version as the App Store today: build 75 = version 5.7.55 is IN_BETA_TESTING in the external group “knokkeroo Beta Testers iOS”. The newest build ATTACHED to that group is build 76 = version 5.7.59, processingState VALID, not expired — but its externalBuildState is WAITING_FOR_BETA_REVIEW, so testers cannot install it yet. Attached is not installable. Google Play is already live on 5.7.59, so Android is ahead of iPhone at the moment. What 5.7.59 changes for a tester: the app no longer records a check-in on its own while the phone sits idle — a check-in happens only when you do something (knok, open the app, widget, Watch, TV). On 5.7.59 a phone left untouched must NOT advance its own last-knok time. Apple TV: TestFlight build 68 (5.3.6), externalBuildState IN_BETA_TESTING, 4 testers — the TV app is not on the App Store (its only App Store Connect version record is 1.0 in state PREPARE_FOR_SUBMISSION, and the public iTunes lookup for id 6795920763 returns no result) and was not part of the 5.7.55 or 5.7.59 rounds. All build, version and tester-group facts read live from the App Store Connect API on 13 September 2026.</w:t>
+              <w:t>iPhone + Apple Watch: App Store 5.7.59 — Apple approved and released it at 23:59 UTC on 13 September 2026, replacing 5.7.55, and it is what the App Store serves now. Read from the public iTunes lookup for app id 6776208791 (US, ZA, NG and GB storefronts, version 5.7.59, currentVersionReleaseDate 2026-09-13T23:59:39Z) and confirmed in App Store Connect (appStoreVersion 5.7.59, build 76, READY_FOR_SALE; every version record is READY_FOR_SALE, so nothing is waiting for review). TestFlight installs the same version as the App Store today: build 76 = version 5.7.59 is IN_BETA_TESTING in the external group “knokkeroo Beta Testers iOS” (beta review APPROVED), processingState VALID, not expired. Google Play is also live on 5.7.59, so iPhone and Android are level. What 5.7.59 changes for a tester: the app no longer records a check-in on its own while the phone sits idle — a check-in happens only when you do something (knok, open the app, widget, Watch, TV). On 5.7.59 a phone left untouched must NOT advance its own last-knok time. Apple TV: TestFlight build 68 (5.3.6), externalBuildState IN_BETA_TESTING, 4 testers — the TV app is not on the App Store (its only App Store Connect version record is 1.0 in state PREPARE_FOR_SUBMISSION, and the public iTunes lookup for id 6795920763 returns no result) and was not part of the 5.7.55 or 5.7.59 rounds. All build, version and tester-group facts read live from the App Store Connect API on 15 September 2026.</w:t>
             </w:r>
           </w:p>
         </w:tc>
@@ -141,7 +141,7 @@
           </w:tcPr>
           <w:p>
             <w:r>
-              <w:t>13 September 2026</w:t>
+              <w:t>15 September 2026</w:t>
             </w:r>
           </w:p>
         </w:tc>
@@ -433,7 +433,7 @@
               <w:rPr>
                 <w:sz w:val="18"/>
               </w:rPr>
-              <w:t>knokkeroo (5.7.55 — from the App Store, or TestFlight build 75, which is the same version) installs and launches.</w:t>
+              <w:t>knokkeroo (5.7.59 — from the App Store, or TestFlight build 76, which is the same version) installs and launches.</w:t>
             </w:r>
           </w:p>
         </w:tc>
@@ -1990,7 +1990,7 @@
               </w:rPr>
               <w:t>Lock Screen widget checks you in without unlocking the phone.</w:t>
               <w:br/>
-              <w:t>Preconditions: iPhone on 5.7.55, signed in. The public App Store app is enough — the Lock Screen widget shipped publicly in 5.7.28 and is in every release since, so this is no longer a testing-builds-only case.</w:t>
+              <w:t>Preconditions: iPhone on 5.7.59, signed in. The public App Store app is enough — the Lock Screen widget shipped publicly in 5.7.28 and is in every release since, so this is no longer a testing-builds-only case.</w:t>
             </w:r>
           </w:p>
         </w:tc>

</xml_diff>

<commit_message>
All three stores level on 5.7.60, nothing in review: tester pages, what-is, reviewer page, internal-status, both test plans
iOS 5.7.60 released 2026-09-21T02:25:46Z (iTunes lookup US/ZA/NG/GB, ASC all
READY_FOR_SALE, TestFlight build 77 IN_BETA_TESTING); Play production 5.7.60 +
Android TV 1.0.0 completed; Huawei AppGallery 5.7.60 vc63 on shelf since
2026-09-22. Pages: what-is v15, test v16, test-apple v20, test-apple-iphone v22,
test-google v22, test-huawei v18, internal-status v14, reviewer page 4 Oct 2026.

Co-Authored-By: Claude Opus 5.5 <noreply@anthropic.com>
</commit_message>
<xml_diff>
--- a/downloads/knokkeroo-tester-test-plan-apple.docx
+++ b/downloads/knokkeroo-tester-test-plan-apple.docx
@@ -66,7 +66,7 @@
           </w:tcPr>
           <w:p>
             <w:r>
-              <w:t>iPhone + Apple Watch: App Store 5.7.59 — Apple approved and released it at 23:59 UTC on 13 September 2026, replacing 5.7.55, and it is what the App Store serves now. Read from the public iTunes lookup for app id 6776208791 (US, ZA, NG and GB storefronts, version 5.7.59, currentVersionReleaseDate 2026-09-13T23:59:39Z) and confirmed in App Store Connect (appStoreVersion 5.7.59, build 76, READY_FOR_SALE; every version record is READY_FOR_SALE, so nothing is waiting for review). TestFlight installs the same version as the App Store today: build 76 = version 5.7.59 is IN_BETA_TESTING in the external group “knokkeroo Beta Testers iOS” (beta review APPROVED), processingState VALID, not expired. Google Play is also live on 5.7.59, so iPhone and Android are level. What 5.7.59 changes for a tester: the app no longer records a check-in on its own while the phone sits idle — a check-in happens only when you do something (knok, open the app, widget, Watch, TV). On 5.7.59 a phone left untouched must NOT advance its own last-knok time. Apple TV: TestFlight build 68 (5.3.6), externalBuildState IN_BETA_TESTING, 4 testers — the TV app is not on the App Store (its only App Store Connect version record is 1.0 in state PREPARE_FOR_SUBMISSION, and the public iTunes lookup for id 6795920763 returns no result) and was not part of the 5.7.55 or 5.7.59 rounds. All build, version and tester-group facts read live from the App Store Connect API on 15 September 2026.</w:t>
+              <w:t>iPhone + Apple Watch: App Store 5.7.60 — Apple approved and released it at 02:25 UTC on 21 September 2026, replacing 5.7.59, and it is what the App Store serves now. Read from the public iTunes lookup for app id 6776208791 (US, ZA, NG and GB storefronts, version 5.7.60, currentVersionReleaseDate 2026-09-21T02:25:46Z) and confirmed in App Store Connect (appStoreVersion 5.7.60, build 77, READY_FOR_SALE; every version record is READY_FOR_SALE, so nothing is waiting for review). 5.7.60 changes nothing in behaviour from 5.7.59. TestFlight installs the same version as the App Store today: build 77 = version 5.7.60 is IN_BETA_TESTING in the external group “knokkeroo Beta Testers iOS” (beta review APPROVED), processingState VALID, not expired. Google Play and Huawei AppGallery are also live on 5.7.60, so all three stores are level. What 5.7.59 changed for a tester (unchanged in 5.7.60): the app no longer records a check-in on its own while the phone sits idle — a check-in happens only when you do something (knok, open the app, widget, Watch, TV). On 5.7.60 a phone left untouched must NOT advance its own last-knok time. Apple TV: TestFlight build 68 (5.3.6), externalBuildState IN_BETA_TESTING, 4 testers — the TV app is not on the App Store (its only App Store Connect version record is 1.0 in state PREPARE_FOR_SUBMISSION, and the public iTunes lookup for id 6795920763 returns no result) and was not part of the 5.7.55, 5.7.59 or 5.7.60 rounds. All build, version and tester-group facts read live from the App Store Connect API on 4 October 2026.</w:t>
             </w:r>
           </w:p>
         </w:tc>
@@ -141,7 +141,7 @@
           </w:tcPr>
           <w:p>
             <w:r>
-              <w:t>15 September 2026</w:t>
+              <w:t>4 October 2026</w:t>
             </w:r>
           </w:p>
         </w:tc>
@@ -433,7 +433,7 @@
               <w:rPr>
                 <w:sz w:val="18"/>
               </w:rPr>
-              <w:t>knokkeroo (5.7.59 — from the App Store, or TestFlight build 76, which is the same version) installs and launches.</w:t>
+              <w:t>knokkeroo (5.7.60 — from the App Store, or TestFlight build 77, which is the same version) installs and launches.</w:t>
             </w:r>
           </w:p>
         </w:tc>
@@ -1990,7 +1990,7 @@
               </w:rPr>
               <w:t>Lock Screen widget checks you in without unlocking the phone.</w:t>
               <w:br/>
-              <w:t>Preconditions: iPhone on 5.7.59, signed in. The public App Store app is enough — the Lock Screen widget shipped publicly in 5.7.28 and is in every release since, so this is no longer a testing-builds-only case.</w:t>
+              <w:t>Preconditions: iPhone on 5.7.60, signed in. The public App Store app is enough — the Lock Screen widget shipped publicly in 5.7.28 and is in every release since, so this is no longer a testing-builds-only case.</w:t>
             </w:r>
           </w:p>
         </w:tc>

</xml_diff>

<commit_message>
Huawei 5.7.62 live: reviewer and tester pages, tester plans re-stamped (x68)
Also strips the stray end of the source comment that was showing at the top of the reviewer page.

Co-Authored-By: Claude Opus 5.5 <noreply@anthropic.com>
</commit_message>
<xml_diff>
--- a/downloads/knokkeroo-tester-test-plan-apple.docx
+++ b/downloads/knokkeroo-tester-test-plan-apple.docx
@@ -66,7 +66,7 @@
           </w:tcPr>
           <w:p>
             <w:r>
-              <w:t>iPhone + Apple Watch: App Store 5.7.60 — Apple approved and released it at 02:25 UTC on 21 September 2026, replacing 5.7.59, and it is what the App Store serves now. Read from the public iTunes lookup for app id 6776208791 (US, ZA, NG and GB storefronts, version 5.7.60, currentVersionReleaseDate 2026-09-21T02:25:46Z) and confirmed in App Store Connect (appStoreVersion 5.7.60, build 77, READY_FOR_SALE; every version record is READY_FOR_SALE, so nothing is waiting for review). 5.7.60 changes nothing in behaviour from 5.7.59. TestFlight installs the same version as the App Store today: build 77 = version 5.7.60 is IN_BETA_TESTING in the external group “knokkeroo Beta Testers iOS” (beta review APPROVED), processingState VALID, not expired. Google Play and Huawei AppGallery are also live on 5.7.60, so all three stores are level. What 5.7.59 changed for a tester (unchanged in 5.7.60): the app no longer records a check-in on its own while the phone sits idle — a check-in happens only when you do something (knok, open the app, widget, Watch, TV). On 5.7.60 a phone left untouched must NOT advance its own last-knok time. Apple TV: TestFlight build 68 (5.3.6), externalBuildState IN_BETA_TESTING, 4 testers — the TV app is not on the App Store (its only App Store Connect version record is 1.0 in state PREPARE_FOR_SUBMISSION, and the public iTunes lookup for id 6795920763 returns no result) and was not part of the 5.7.55, 5.7.59 or 5.7.60 rounds. All build, version and tester-group facts read live from the App Store Connect API on 4 October 2026.</w:t>
+              <w:t>iPhone + Apple Watch: App Store 5.7.62 — Apple approved and released it at 01:39 UTC on 8 October 2026, replacing 5.7.60, and it is what the App Store serves now. Read from the public iTunes lookup for app id 6776208791 (US, ZA, NG and GB storefronts, version 5.7.62, currentVersionReleaseDate 2026-10-08T01:39:21Z) and confirmed in App Store Connect (appStoreVersion 5.7.62 READY_FOR_SALE; every version record is READY_FOR_SALE, so nothing is waiting for review). 5.7.62 is a two-fix release on top of 5.7.60, with no new screens or permissions. TestFlight is one version behind the App Store today: its newest build is build 77 = version 5.7.60, IN_BETA_TESTING in the external group “knokkeroo Beta Testers iOS”, processingState VALID, not expired; build 78 (5.7.62) is not in that group. Google Play and Huawei AppGallery are also live on 5.7.62, so all three stores are level. What 5.7.59 changed for a tester (unchanged in 5.7.62): the app no longer records a check-in on its own while the phone sits idle — a check-in happens only when you do something (knok, open the app, widget, Watch, TV). On 5.7.62 a phone left untouched must NOT advance its own last-knok time. Apple TV: TestFlight build 68 (5.3.6), externalBuildState IN_BETA_TESTING, 4 testers — the TV app is not on the App Store (its only App Store Connect version record is 1.0 in state PREPARE_FOR_SUBMISSION, and the public iTunes lookup for id 6795920763 returns no result) and was not part of the 5.7.55, 5.7.59, 5.7.60 or 5.7.62 rounds. All build, version and tester-group facts read live from the App Store Connect API on 16 October 2026.</w:t>
             </w:r>
           </w:p>
         </w:tc>
@@ -141,7 +141,7 @@
           </w:tcPr>
           <w:p>
             <w:r>
-              <w:t>4 October 2026</w:t>
+              <w:t>16 October 2026</w:t>
             </w:r>
           </w:p>
         </w:tc>
@@ -433,7 +433,7 @@
               <w:rPr>
                 <w:sz w:val="18"/>
               </w:rPr>
-              <w:t>knokkeroo (5.7.60 — from the App Store, or TestFlight build 77, which is the same version) installs and launches.</w:t>
+              <w:t>knokkeroo (5.7.62 from the App Store, or 5.7.60 from TestFlight build 77, one version behind) installs and launches.</w:t>
             </w:r>
           </w:p>
         </w:tc>
@@ -1990,7 +1990,7 @@
               </w:rPr>
               <w:t>Lock Screen widget checks you in without unlocking the phone.</w:t>
               <w:br/>
-              <w:t>Preconditions: iPhone on 5.7.60, signed in. The public App Store app is enough — the Lock Screen widget shipped publicly in 5.7.28 and is in every release since, so this is no longer a testing-builds-only case.</w:t>
+              <w:t>Preconditions: iPhone on 5.7.62 (or TestFlight 5.7.60), signed in. The public App Store app is enough — the Lock Screen widget shipped publicly in 5.7.28 and is in every release since, so this is no longer a testing-builds-only case.</w:t>
             </w:r>
           </w:p>
         </w:tc>

</xml_diff>